<commit_message>
Literatür taraması ekle, kaynakça atıf hatasını düzelt
Denetimde bulunanlar:
- Kaynakçadaki matplotlib, seaborn ve pandas kaynakları metinde hiç atıf
  almıyordu; APA'da kaynakça yalnızca atıf yapılan eserleri içerir.
  İlgili bölümlerde atıfları eklendi.
- Kılavuz, Giriş bölümünde literatür taraması istiyor; bölüm tek kaynağa
  dayanıyordu. Antonio, de Almeida ve Nunes'un konuyla doğrudan ilgili üç
  çalışması (2017a, 2017b, 2019a) eklendi.
- 1.3'teki "oteller katı iptal politikası ve aşırı rezervasyona başvuruyor"
  iddiası kaynaksızdı; 2017a çalışmasına dayandırıldı.
- Aynı yazarların dört çalışması olduğu için yıl ekleri (2017a/b, 2019a/b)
  kullanıldı, kaynakça alfabetik ve kronolojik sıraya alındı.

Rapor 24 -> 25 sayfa. İçindekiler numaraları yeniden ölçülüp güncellendi.

Co-Authored-By: Claude Opus 5 <noreply@anthropic.com>
Claude-Session: https://claude.ai/code/session_01SLRu2Fk7T43tjrwnZqxxsA
</commit_message>
<xml_diff>
--- a/build/rapor.docx
+++ b/build/rapor.docx
@@ -427,7 +427,7 @@
         <w:tab/>
       </w:r>
       <w:r>
-        <w:t xml:space="preserve">: 24</w:t>
+        <w:t xml:space="preserve">: 25</w:t>
       </w:r>
     </w:p>
     <w:p>
@@ -950,7 +950,7 @@
           <w:b/>
           <w:bCs/>
         </w:rPr>
-        <w:t xml:space="preserve">2</w:t>
+        <w:t xml:space="preserve">3</w:t>
       </w:r>
     </w:p>
     <w:p>
@@ -980,7 +980,7 @@
           <w:b w:val="false"/>
           <w:bCs w:val="false"/>
         </w:rPr>
-        <w:t xml:space="preserve">2</w:t>
+        <w:t xml:space="preserve">3</w:t>
       </w:r>
     </w:p>
     <w:p>
@@ -1010,7 +1010,7 @@
           <w:b w:val="false"/>
           <w:bCs w:val="false"/>
         </w:rPr>
-        <w:t xml:space="preserve">2</w:t>
+        <w:t xml:space="preserve">3</w:t>
       </w:r>
     </w:p>
     <w:p>
@@ -1040,7 +1040,7 @@
           <w:b w:val="false"/>
           <w:bCs w:val="false"/>
         </w:rPr>
-        <w:t xml:space="preserve">3</w:t>
+        <w:t xml:space="preserve">4</w:t>
       </w:r>
     </w:p>
     <w:p>
@@ -1070,7 +1070,7 @@
           <w:b w:val="false"/>
           <w:bCs w:val="false"/>
         </w:rPr>
-        <w:t xml:space="preserve">3</w:t>
+        <w:t xml:space="preserve">4</w:t>
       </w:r>
     </w:p>
     <w:p>
@@ -1100,7 +1100,7 @@
           <w:b w:val="false"/>
           <w:bCs w:val="false"/>
         </w:rPr>
-        <w:t xml:space="preserve">4</w:t>
+        <w:t xml:space="preserve">5</w:t>
       </w:r>
     </w:p>
     <w:p>
@@ -1130,7 +1130,7 @@
           <w:b w:val="false"/>
           <w:bCs w:val="false"/>
         </w:rPr>
-        <w:t xml:space="preserve">4</w:t>
+        <w:t xml:space="preserve">5</w:t>
       </w:r>
     </w:p>
     <w:p>
@@ -1180,7 +1180,7 @@
           <w:b/>
           <w:bCs/>
         </w:rPr>
-        <w:t xml:space="preserve">6</w:t>
+        <w:t xml:space="preserve">7</w:t>
       </w:r>
     </w:p>
     <w:p>
@@ -1210,7 +1210,7 @@
           <w:b w:val="false"/>
           <w:bCs w:val="false"/>
         </w:rPr>
-        <w:t xml:space="preserve">6</w:t>
+        <w:t xml:space="preserve">7</w:t>
       </w:r>
     </w:p>
     <w:p>
@@ -1240,7 +1240,7 @@
           <w:b w:val="false"/>
           <w:bCs w:val="false"/>
         </w:rPr>
-        <w:t xml:space="preserve">6</w:t>
+        <w:t xml:space="preserve">7</w:t>
       </w:r>
     </w:p>
     <w:p>
@@ -1270,7 +1270,7 @@
           <w:b w:val="false"/>
           <w:bCs w:val="false"/>
         </w:rPr>
-        <w:t xml:space="preserve">8</w:t>
+        <w:t xml:space="preserve">9</w:t>
       </w:r>
     </w:p>
     <w:p>
@@ -1300,7 +1300,7 @@
           <w:b w:val="false"/>
           <w:bCs w:val="false"/>
         </w:rPr>
-        <w:t xml:space="preserve">8</w:t>
+        <w:t xml:space="preserve">9</w:t>
       </w:r>
     </w:p>
     <w:p>
@@ -1330,7 +1330,7 @@
           <w:b w:val="false"/>
           <w:bCs w:val="false"/>
         </w:rPr>
-        <w:t xml:space="preserve">9</w:t>
+        <w:t xml:space="preserve">10</w:t>
       </w:r>
     </w:p>
     <w:p>
@@ -1380,7 +1380,7 @@
           <w:b/>
           <w:bCs/>
         </w:rPr>
-        <w:t xml:space="preserve">13</w:t>
+        <w:t xml:space="preserve">14</w:t>
       </w:r>
     </w:p>
     <w:p>
@@ -1410,7 +1410,7 @@
           <w:b w:val="false"/>
           <w:bCs w:val="false"/>
         </w:rPr>
-        <w:t xml:space="preserve">13</w:t>
+        <w:t xml:space="preserve">14</w:t>
       </w:r>
     </w:p>
     <w:p>
@@ -1440,7 +1440,7 @@
           <w:b w:val="false"/>
           <w:bCs w:val="false"/>
         </w:rPr>
-        <w:t xml:space="preserve">14</w:t>
+        <w:t xml:space="preserve">15</w:t>
       </w:r>
     </w:p>
     <w:p>
@@ -1478,7 +1478,7 @@
           <w:b w:val="false"/>
           <w:bCs w:val="false"/>
         </w:rPr>
-        <w:t xml:space="preserve">15</w:t>
+        <w:t xml:space="preserve">16</w:t>
       </w:r>
     </w:p>
     <w:p>
@@ -1508,7 +1508,7 @@
           <w:b w:val="false"/>
           <w:bCs w:val="false"/>
         </w:rPr>
-        <w:t xml:space="preserve">16</w:t>
+        <w:t xml:space="preserve">17</w:t>
       </w:r>
     </w:p>
     <w:p>
@@ -1565,7 +1565,7 @@
           <w:b w:val="false"/>
           <w:bCs w:val="false"/>
         </w:rPr>
-        <w:t xml:space="preserve">7</w:t>
+        <w:t xml:space="preserve">8</w:t>
       </w:r>
     </w:p>
     <w:p>
@@ -1595,7 +1595,7 @@
           <w:b w:val="false"/>
           <w:bCs w:val="false"/>
         </w:rPr>
-        <w:t xml:space="preserve">9</w:t>
+        <w:t xml:space="preserve">10</w:t>
       </w:r>
     </w:p>
     <w:p>
@@ -1625,7 +1625,7 @@
           <w:b w:val="false"/>
           <w:bCs w:val="false"/>
         </w:rPr>
-        <w:t xml:space="preserve">10</w:t>
+        <w:t xml:space="preserve">11</w:t>
       </w:r>
     </w:p>
     <w:p>
@@ -1655,7 +1655,7 @@
           <w:b w:val="false"/>
           <w:bCs w:val="false"/>
         </w:rPr>
-        <w:t xml:space="preserve">11</w:t>
+        <w:t xml:space="preserve">12</w:t>
       </w:r>
     </w:p>
     <w:p>
@@ -1685,7 +1685,7 @@
           <w:b w:val="false"/>
           <w:bCs w:val="false"/>
         </w:rPr>
-        <w:t xml:space="preserve">12</w:t>
+        <w:t xml:space="preserve">13</w:t>
       </w:r>
     </w:p>
     <w:p>
@@ -1753,7 +1753,7 @@
           <w:b w:val="false"/>
           <w:bCs w:val="false"/>
         </w:rPr>
-        <w:t xml:space="preserve">6</w:t>
+        <w:t xml:space="preserve">7</w:t>
       </w:r>
     </w:p>
     <w:p>
@@ -1783,7 +1783,7 @@
           <w:b w:val="false"/>
           <w:bCs w:val="false"/>
         </w:rPr>
-        <w:t xml:space="preserve">7</w:t>
+        <w:t xml:space="preserve">8</w:t>
       </w:r>
     </w:p>
     <w:p>
@@ -1813,7 +1813,7 @@
           <w:b w:val="false"/>
           <w:bCs w:val="false"/>
         </w:rPr>
-        <w:t xml:space="preserve">8</w:t>
+        <w:t xml:space="preserve">9</w:t>
       </w:r>
     </w:p>
     <w:p>
@@ -1952,7 +1952,16 @@
         <w:jc w:val="both"/>
       </w:pPr>
       <w:r>
-        <w:t xml:space="preserve">Antonio, de Almeida ve Nunes (2019) tarafından yayımlanan ve bu çalışmada da kullanılan veri seti, iki otele ait 119.390 rezervasyon kaydını içermektedir. Bu kayıtların %37,04’ünün iptal edilmiş olması, problemin istisnai bir durum değil, sektörün yapısal bir sorunu olduğunu göstermektedir. Üç rezervasyondan birinden fazlasının gerçekleşmediği bir ortamda, hangi rezervasyonun gerçekleşeceğini önceden bilmek doğrudan ekonomik değer taşımaktadır.</w:t>
+        <w:t xml:space="preserve">Antonio, de Almeida ve Nunes (2019b) tarafından yayımlanan ve bu çalışmada da kullanılan veri seti, iki otele ait 119.390 rezervasyon kaydını içermektedir. Bu kayıtların %37,04’ünün iptal edilmiş olması, problemin istisnai bir durum değil, sektörün yapısal bir sorunu olduğunu göstermektedir. Üç rezervasyondan birinden fazlasının gerçekleşmediği bir ortamda, hangi rezervasyonun gerçekleşeceğini önceden bilmek doğrudan ekonomik değer taşımaktadır.</w:t>
+      </w:r>
+    </w:p>
+    <w:p>
+      <w:pPr>
+        <w:spacing w:after="0" w:before="0" w:line="360" w:lineRule="auto"/>
+        <w:jc w:val="both"/>
+      </w:pPr>
+      <w:r>
+        <w:t xml:space="preserve">Rezervasyon iptalinin makine öğrenmesi ile tahmini, literatürde çalışılmış bir problemdir. Antonio, de Almeida ve Nunes (2017a), dört tatil köyüne ait verilerle kurdukları sınıflandırma modellerinde %90’ın üzerinde doğruluk elde etmiş ve bu sonucun, iptal tahmininin yüksek doğrulukla yapılamayacağı yönündeki önceki varsayımla çeliştiğini belirtmişlerdir. Aynı araştırmacılar (2017b) geliştirdikleri modeli bir otelin yönetim sistemine bağlayarak her gün yeniden eğitilen bir prototipe dönüştürmüş; 2019 yılındaki çalışmalarında ise (2019a) bu prototipi iki otelde gerçek işletme ortamında denemişlerdir. Söz konusu denemede, iptal olasılığı yüksek olarak işaretlenen ve otel tarafından iletişime geçilen rezervasyonların, iletişime geçilmeyenlere kıyasla daha az iptal edildiği gözlenmiştir. Bu bulgu, iptal tahmininin yalnızca bir ölçüm aracı olmadığını, alınan aksiyonla birlikte iptal oranını fiilen düşürebildiğini göstermesi bakımından önemlidir.</w:t>
       </w:r>
     </w:p>
     <w:p>
@@ -2166,7 +2175,7 @@
         <w:jc w:val="both"/>
       </w:pPr>
       <w:r>
-        <w:t xml:space="preserve">Otellerin iptal riskini yönetmek için hâlihazırda başvurduğu yöntemler üç başlıkta toplanabilir. Bu yöntemlerin her biri belirli bir fayda sağlamakla birlikte, ortak bir zaafa sahiptir: hiçbiri rezervasyonu müşteri düzeyinde değerlendirmemektedir.</w:t>
+        <w:t xml:space="preserve">Otellerin iptal riskini yönetmek için hâlihazırda başvurduğu yöntemler üç başlıkta toplanabilir. Antonio, de Almeida ve Nunes (2017a) de otellerin belirsizliğe karşı ağırlıklı olarak katı iptal politikaları ve aşırı rezervasyon uygulamalarına başvurduğunu, bu önlemlerin ise otelin hem gelirini hem itibarını olumsuz etkileyebildiğini belirtmektedir. Aşağıda ele alınan yöntemlerin her biri belirli bir fayda sağlamakla birlikte ortak bir zaafa sahiptir: hiçbiri rezervasyonu müşteri düzeyinde değerlendirmemektedir.</w:t>
       </w:r>
     </w:p>
     <w:p>
@@ -2486,16 +2495,16 @@
         <w:jc w:val="both"/>
       </w:pPr>
       <w:r>
-        <w:t xml:space="preserve">Çalışmada kullanılan veri seti, Kaggle veri bilimi platformunda “Hotel Booking Demand” adıyla yayımlanan açık erişimli veri setidir (Mostipak, 2020). Veri setinin özgün kaynağı, Antonio, de Almeida ve Nunes (2019) tarafından Data in Brief dergisinde yayımlanan çalışmadır. Veriler Portekiz’de bulunan bir şehir oteli ile bir tatil köyüne ait gerçek rezervasyon kayıtlarından oluşmaktadır ve 2015-2017 yıllarını kapsamaktadır.</w:t>
-      </w:r>
-    </w:p>
-    <w:p>
-      <w:pPr>
-        <w:spacing w:after="0" w:before="0" w:line="360" w:lineRule="auto"/>
-        <w:jc w:val="both"/>
-      </w:pPr>
-      <w:r>
-        <w:t xml:space="preserve">Veri seti tabüler türdedir ve virgülle ayrılmış değer (CSV) biçiminde saklanmaktadır. Veri setinin genel özellikleri Tablo-1’de verilmiştir.</w:t>
+        <w:t xml:space="preserve">Çalışmada kullanılan veri seti, Kaggle veri bilimi platformunda “Hotel Booking Demand” adıyla yayımlanan açık erişimli veri setidir (Mostipak, 2020). Veri setinin özgün kaynağı, Antonio, de Almeida ve Nunes (2019b) tarafından Data in Brief dergisinde yayımlanan çalışmadır. Veriler Portekiz’de bulunan bir şehir oteli ile bir tatil köyüne ait gerçek rezervasyon kayıtlarından oluşmaktadır ve 2015-2017 yıllarını kapsamaktadır.</w:t>
+      </w:r>
+    </w:p>
+    <w:p>
+      <w:pPr>
+        <w:spacing w:after="0" w:before="0" w:line="360" w:lineRule="auto"/>
+        <w:jc w:val="both"/>
+      </w:pPr>
+      <w:r>
+        <w:t xml:space="preserve">Veri seti tabüler türdedir ve virgülle ayrılmış değer (CSV) biçiminde saklanmaktadır. Veri seti üzerindeki tüm inceleme ve ön işleme adımları, Google Colab ortamında pandas kütüphanesi (McKinney, 2010) kullanılarak gerçekleştirilmiştir. Veri setinin genel özellikleri Tablo-1’de verilmiştir.</w:t>
       </w:r>
     </w:p>
     <w:p>
@@ -4340,7 +4349,7 @@
         <w:jc w:val="both"/>
       </w:pPr>
       <w:r>
-        <w:t xml:space="preserve">Veri setinin yapısı ve sınıf dağılımları, Google Colab ortamında Matplotlib ve Seaborn kütüphaneleri kullanılarak beş farklı grafikle incelenmiştir. Eksik veri dağılımını gösteren Grafik-1 bölüm 2.2’de sunulmuştur. Bu bölümde kalan dört grafik ele alınmaktadır.</w:t>
+        <w:t xml:space="preserve">Veri setinin yapısı ve sınıf dağılımları, Google Colab ortamında Matplotlib (Hunter, 2007) ve Seaborn (Waskom, 2021) kütüphaneleri kullanılarak beş farklı grafikle incelenmiştir. Eksik veri dağılımını gösteren Grafik-1 bölüm 2.2’de sunulmuştur. Bu bölümde kalan dört grafik ele alınmaktadır.</w:t>
       </w:r>
     </w:p>
     <w:p>
@@ -5268,7 +5277,7 @@
         <w:jc w:val="both"/>
       </w:pPr>
       <w:r>
-        <w:t xml:space="preserve">Antonio, N., de Almeida, A. ve Nunes, L. (2019). Hotel booking demand datasets. Data in Brief, 22, 41-49. doi:10.1016/j.dib.2018.11.126</w:t>
+        <w:t xml:space="preserve">Antonio, N., de Almeida, A. ve Nunes, L. (2017a). Predicting hotel booking cancellations to decrease uncertainty and increase revenue. Tourism &amp; Management Studies, 13(2), 25-39. doi:10.18089/tms.2017.13203</w:t>
       </w:r>
     </w:p>
     <w:p>
@@ -5278,7 +5287,7 @@
         <w:jc w:val="both"/>
       </w:pPr>
       <w:r>
-        <w:t xml:space="preserve">Mostipak, J. (2020). Hotel booking demand [Veri seti]. Erişim tarihi: 9 Ekim 2026, https://www.kaggle.com/datasets/jessemostipak/hotel-booking-demand</w:t>
+        <w:t xml:space="preserve">Antonio, N., de Almeida, A. ve Nunes, L. (2017b). Predicting hotel bookings cancellation with a machine learning classification model. 16th IEEE International Conference on Machine Learning and Applications (ICMLA) bildiriler kitabı içinde (ss. 1049-1054). Cancun: IEEE. doi:10.1109/ICMLA.2017.00-11</w:t>
       </w:r>
     </w:p>
     <w:p>
@@ -5288,7 +5297,7 @@
         <w:jc w:val="both"/>
       </w:pPr>
       <w:r>
-        <w:t xml:space="preserve">Hunter, J.D. (2007). Matplotlib: A 2D graphics environment. Computing in Science &amp; Engineering, 9(3), 90-95. doi:10.1109/MCSE.2007.55</w:t>
+        <w:t xml:space="preserve">Antonio, N., de Almeida, A. ve Nunes, L. (2019a). An automated machine learning based decision support system to predict hotel booking cancellations. Data Science Journal, 18(1), 32. doi:10.5334/dsj-2019-032</w:t>
       </w:r>
     </w:p>
     <w:p>
@@ -5298,7 +5307,7 @@
         <w:jc w:val="both"/>
       </w:pPr>
       <w:r>
-        <w:t xml:space="preserve">Waskom, M.L. (2021). Seaborn: Statistical data visualization. Journal of Open Source Software, 6(60), 3021. doi:10.21105/joss.03021</w:t>
+        <w:t xml:space="preserve">Antonio, N., de Almeida, A. ve Nunes, L. (2019b). Hotel booking demand datasets. Data in Brief, 22, 41-49. doi:10.1016/j.dib.2018.11.126</w:t>
       </w:r>
     </w:p>
     <w:p>
@@ -5308,7 +5317,37 @@
         <w:jc w:val="both"/>
       </w:pPr>
       <w:r>
+        <w:t xml:space="preserve">Hunter, J.D. (2007). Matplotlib: A 2D graphics environment. Computing in Science &amp; Engineering, 9(3), 90-95. doi:10.1109/MCSE.2007.55</w:t>
+      </w:r>
+    </w:p>
+    <w:p>
+      <w:pPr>
+        <w:spacing w:after="180" w:before="0" w:line="240" w:lineRule="auto"/>
+        <w:ind w:hanging="567"/>
+        <w:jc w:val="both"/>
+      </w:pPr>
+      <w:r>
         <w:t xml:space="preserve">McKinney, W. (2010). Data structures for statistical computing in Python. S. van der Walt ve J. Millman (Ed.), 9th Python in Science Conference bildiriler kitabı içinde (ss. 56-61). doi:10.25080/Majora-92bf1922-00a</w:t>
+      </w:r>
+    </w:p>
+    <w:p>
+      <w:pPr>
+        <w:spacing w:after="180" w:before="0" w:line="240" w:lineRule="auto"/>
+        <w:ind w:hanging="567"/>
+        <w:jc w:val="both"/>
+      </w:pPr>
+      <w:r>
+        <w:t xml:space="preserve">Mostipak, J. (2020). Hotel booking demand [Veri seti]. Erişim tarihi: 9 Ekim 2026, https://www.kaggle.com/datasets/jessemostipak/hotel-booking-demand</w:t>
+      </w:r>
+    </w:p>
+    <w:p>
+      <w:pPr>
+        <w:spacing w:after="180" w:before="0" w:line="240" w:lineRule="auto"/>
+        <w:ind w:hanging="567"/>
+        <w:jc w:val="both"/>
+      </w:pPr>
+      <w:r>
+        <w:t xml:space="preserve">Waskom, M.L. (2021). Seaborn: Statistical data visualization. Journal of Open Source Software, 6(60), 3021. doi:10.21105/joss.03021</w:t>
       </w:r>
     </w:p>
     <w:sectPr>

</xml_diff>

<commit_message>
Teslim tarihi ve imzayı belgeye ekle
- Ödev tanıtım formuna teslim tarihi işlendi: 13/10/2026
- Beyan sayfasına tarih, ad soyad ve öğrencinin imza görseli yerleştirildi
- İmza PNG'si şeffaf arka planıyla korunup mürekkep sınırlarına kırpıldı
- Tanıtım formunda uzun değerlerin alt satıra taşınca hizadan çıkması
  asılı girinti ile giderildi
- İmza görseli ve imzalı teslim paketi .gitignore'a alındı: imza kişisel
  veridir, depoya konmaması tercih edildi
</commit_message>
<xml_diff>
--- a/build/rapor.docx
+++ b/build/rapor.docx
@@ -300,6 +300,7 @@
           <w:tab w:val="left" w:pos="4000"/>
         </w:tabs>
         <w:spacing w:after="0" w:before="0" w:line="360" w:lineRule="auto"/>
+        <w:ind w:left="4000" w:hanging="4000"/>
       </w:pPr>
       <w:r>
         <w:t xml:space="preserve">YAZAR ADI SOYADI</w:t>
@@ -317,6 +318,7 @@
           <w:tab w:val="left" w:pos="4000"/>
         </w:tabs>
         <w:spacing w:after="0" w:before="0" w:line="360" w:lineRule="auto"/>
+        <w:ind w:left="4000" w:hanging="4000"/>
       </w:pPr>
       <w:r>
         <w:t xml:space="preserve">ÖDEVİN DİLİ</w:t>
@@ -334,6 +336,7 @@
           <w:tab w:val="left" w:pos="4000"/>
         </w:tabs>
         <w:spacing w:after="0" w:before="0" w:line="360" w:lineRule="auto"/>
+        <w:ind w:left="4000" w:hanging="4000"/>
       </w:pPr>
       <w:r>
         <w:t xml:space="preserve">ÖDEVİN ADI</w:t>
@@ -351,6 +354,7 @@
           <w:tab w:val="left" w:pos="4000"/>
         </w:tabs>
         <w:spacing w:after="0" w:before="0" w:line="360" w:lineRule="auto"/>
+        <w:ind w:left="4000" w:hanging="4000"/>
       </w:pPr>
       <w:r>
         <w:t xml:space="preserve">BÖLÜM</w:t>
@@ -368,6 +372,7 @@
           <w:tab w:val="left" w:pos="4000"/>
         </w:tabs>
         <w:spacing w:after="0" w:before="0" w:line="360" w:lineRule="auto"/>
+        <w:ind w:left="4000" w:hanging="4000"/>
       </w:pPr>
       <w:r>
         <w:t xml:space="preserve">PROGRAM</w:t>
@@ -385,6 +390,7 @@
           <w:tab w:val="left" w:pos="4000"/>
         </w:tabs>
         <w:spacing w:after="0" w:before="0" w:line="360" w:lineRule="auto"/>
+        <w:ind w:left="4000" w:hanging="4000"/>
       </w:pPr>
       <w:r>
         <w:t xml:space="preserve">ÖDEVİN TÜRÜ</w:t>
@@ -402,6 +408,7 @@
           <w:tab w:val="left" w:pos="4000"/>
         </w:tabs>
         <w:spacing w:after="0" w:before="0" w:line="360" w:lineRule="auto"/>
+        <w:ind w:left="4000" w:hanging="4000"/>
       </w:pPr>
       <w:r>
         <w:t xml:space="preserve">ÖDEVİN TES. TARİHİ</w:t>
@@ -410,7 +417,7 @@
         <w:tab/>
       </w:r>
       <w:r>
-        <w:t xml:space="preserve">: …… / …… / 2026</w:t>
+        <w:t xml:space="preserve">: 13 / 10 / 2026</w:t>
       </w:r>
     </w:p>
     <w:p>
@@ -419,6 +426,7 @@
           <w:tab w:val="left" w:pos="4000"/>
         </w:tabs>
         <w:spacing w:after="0" w:before="0" w:line="360" w:lineRule="auto"/>
+        <w:ind w:left="4000" w:hanging="4000"/>
       </w:pPr>
       <w:r>
         <w:t xml:space="preserve">SAYFA SAYISI</w:t>
@@ -436,6 +444,7 @@
           <w:tab w:val="left" w:pos="4000"/>
         </w:tabs>
         <w:spacing w:after="0" w:before="0" w:line="360" w:lineRule="auto"/>
+        <w:ind w:left="4000" w:hanging="4000"/>
       </w:pPr>
       <w:r>
         <w:t xml:space="preserve">ÖDEV DANIŞMANI</w:t>
@@ -520,7 +529,7 @@
         <w:jc w:val="right"/>
       </w:pPr>
       <w:r>
-        <w:t xml:space="preserve">Tarih</w:t>
+        <w:t xml:space="preserve">13/10/2026</w:t>
       </w:r>
     </w:p>
     <w:p>
@@ -534,11 +543,48 @@
     </w:p>
     <w:p>
       <w:pPr>
-        <w:spacing w:after="0" w:before="0" w:line="360" w:lineRule="auto"/>
+        <w:spacing w:after="0" w:before="0" w:line="240" w:lineRule="auto"/>
         <w:jc w:val="right"/>
       </w:pPr>
       <w:r>
-        <w:t xml:space="preserve">İmza</w:t>
+        <w:drawing>
+          <wp:inline distT="0" distB="0" distL="0" distR="0">
+            <wp:extent cx="1285875" cy="571500"/>
+            <wp:effectExtent t="0" r="0" b="0" l="0"/>
+            <wp:docPr id="1" name="" descr="" title=""/>
+            <wp:cNvGraphicFramePr>
+              <a:graphicFrameLocks xmlns:a="http://schemas.openxmlformats.org/drawingml/2006/main" noChangeAspect="1"/>
+            </wp:cNvGraphicFramePr>
+            <a:graphic xmlns:a="http://schemas.openxmlformats.org/drawingml/2006/main">
+              <a:graphicData uri="http://schemas.openxmlformats.org/drawingml/2006/picture">
+                <pic:pic xmlns:pic="http://schemas.openxmlformats.org/drawingml/2006/picture">
+                  <pic:nvPicPr>
+                    <pic:cNvPr id="0" name="" descr=""/>
+                    <pic:cNvPicPr>
+                      <a:picLocks noChangeAspect="1" noChangeArrowheads="1"/>
+                    </pic:cNvPicPr>
+                  </pic:nvPicPr>
+                  <pic:blipFill>
+                    <a:blip r:embed="rId9" cstate="none"/>
+                    <a:srcRect/>
+                    <a:stretch>
+                      <a:fillRect/>
+                    </a:stretch>
+                  </pic:blipFill>
+                  <pic:spPr bwMode="auto">
+                    <a:xfrm>
+                      <a:off x="0" y="0"/>
+                      <a:ext cx="1285875" cy="571500"/>
+                    </a:xfrm>
+                    <a:prstGeom prst="rect">
+                      <a:avLst/>
+                    </a:prstGeom>
+                  </pic:spPr>
+                </pic:pic>
+              </a:graphicData>
+            </a:graphic>
+          </wp:inline>
+        </w:drawing>
       </w:r>
     </w:p>
     <w:p>
@@ -3150,7 +3196,7 @@
                     </pic:cNvPicPr>
                   </pic:nvPicPr>
                   <pic:blipFill>
-                    <a:blip r:embed="rId9" cstate="none"/>
+                    <a:blip r:embed="rId10" cstate="none"/>
                     <a:srcRect/>
                     <a:stretch>
                       <a:fillRect/>
@@ -4401,7 +4447,7 @@
                     </pic:cNvPicPr>
                   </pic:nvPicPr>
                   <pic:blipFill>
-                    <a:blip r:embed="rId10" cstate="none"/>
+                    <a:blip r:embed="rId11" cstate="none"/>
                     <a:srcRect/>
                     <a:stretch>
                       <a:fillRect/>
@@ -4491,111 +4537,6 @@
         <w:drawing>
           <wp:inline distT="0" distB="0" distL="0" distR="0">
             <wp:extent cx="3914775" cy="2038350"/>
-            <wp:effectExtent t="0" r="0" b="0" l="0"/>
-            <wp:docPr id="1" name="" descr="" title=""/>
-            <wp:cNvGraphicFramePr>
-              <a:graphicFrameLocks xmlns:a="http://schemas.openxmlformats.org/drawingml/2006/main" noChangeAspect="1"/>
-            </wp:cNvGraphicFramePr>
-            <a:graphic xmlns:a="http://schemas.openxmlformats.org/drawingml/2006/main">
-              <a:graphicData uri="http://schemas.openxmlformats.org/drawingml/2006/picture">
-                <pic:pic xmlns:pic="http://schemas.openxmlformats.org/drawingml/2006/picture">
-                  <pic:nvPicPr>
-                    <pic:cNvPr id="0" name="" descr=""/>
-                    <pic:cNvPicPr>
-                      <a:picLocks noChangeAspect="1" noChangeArrowheads="1"/>
-                    </pic:cNvPicPr>
-                  </pic:nvPicPr>
-                  <pic:blipFill>
-                    <a:blip r:embed="rId11" cstate="none"/>
-                    <a:srcRect/>
-                    <a:stretch>
-                      <a:fillRect/>
-                    </a:stretch>
-                  </pic:blipFill>
-                  <pic:spPr bwMode="auto">
-                    <a:xfrm>
-                      <a:off x="0" y="0"/>
-                      <a:ext cx="3914775" cy="2038350"/>
-                    </a:xfrm>
-                    <a:prstGeom prst="rect">
-                      <a:avLst/>
-                    </a:prstGeom>
-                  </pic:spPr>
-                </pic:pic>
-              </a:graphicData>
-            </a:graphic>
-          </wp:inline>
-        </w:drawing>
-      </w:r>
-    </w:p>
-    <w:p>
-      <w:pPr>
-        <w:spacing w:after="180" w:before="0" w:line="240" w:lineRule="auto"/>
-        <w:jc w:val="center"/>
-      </w:pPr>
-      <w:r>
-        <w:rPr>
-          <w:b/>
-          <w:bCs/>
-        </w:rPr>
-        <w:t xml:space="preserve">Grafik-3</w:t>
-      </w:r>
-      <w:r>
-        <w:t xml:space="preserve">. Bekleme Süresinin İptal Durumuna Göre Dağılımı</w:t>
-      </w:r>
-    </w:p>
-    <w:p>
-      <w:pPr>
-        <w:spacing w:after="0" w:before="0" w:line="360" w:lineRule="auto"/>
-        <w:jc w:val="both"/>
-      </w:pPr>
-      <w:r>
-        <w:t xml:space="preserve">Grafik-3’te her iki sınıfın dağılımının da sağa çarpık (right-skewed) olduğu, rezervasyonların büyük bölümünün girişten kısa süre önce yapıldığı görülmektedir. Bununla birlikte iki sınıf arasında belirgin bir fark bulunmaktadır: iptal edilmeyen rezervasyonlar 0-50 gün aralığında yoğunlaşırken, bekleme süresi arttıkça iptal edilen rezervasyonların payı yükselmektedir. Ortalama bekleme süresi iptal edilmeyen rezervasyonlarda yaklaşık 80 gün, iptal edilenlerde ise yaklaşık 145 gündür.</w:t>
-      </w:r>
-    </w:p>
-    <w:p>
-      <w:pPr>
-        <w:spacing w:after="0" w:before="0" w:line="360" w:lineRule="auto"/>
-        <w:jc w:val="both"/>
-      </w:pPr>
-      <w:r>
-        <w:t xml:space="preserve">Bu bulgu sezgisel olarak da tutarlıdır: bir müşteri rezervasyonunu ne kadar erken yaparsa, giriş tarihine kadar planlarının değişmesi için o kadar uzun bir süre geçmektedir. Modelleme açısından sonuç, lead_time özniteliğinin iptal tahmininde en güçlü ayırt edici özniteliklerden biri olacağıdır. Ayrıca dağılımın çarpık olması nedeniyle, mesafe tabanlı algoritmaların kullanılması durumunda bu sütuna ölçeklendirme veya logaritmik dönüşüm uygulanması gerekecektir.</w:t>
-      </w:r>
-    </w:p>
-    <w:p>
-      <w:pPr>
-        <w:pStyle w:val="Heading3"/>
-        <w:spacing w:after="0" w:before="180" w:line="360" w:lineRule="auto"/>
-        <w:jc w:val="left"/>
-      </w:pPr>
-      <w:r>
-        <w:rPr>
-          <w:b/>
-          <w:bCs/>
-        </w:rPr>
-        <w:t xml:space="preserve">2.5.3. Pazar Segmentine Göre İptal Oranları</w:t>
-      </w:r>
-    </w:p>
-    <w:p>
-      <w:pPr>
-        <w:spacing w:after="0" w:before="0" w:line="360" w:lineRule="auto"/>
-        <w:jc w:val="both"/>
-      </w:pPr>
-      <w:r>
-        <w:t xml:space="preserve">Kategorik bir özniteliğin hedef değişkenle ilişkisini incelemek, hangi kategorik özniteliklerin modele katkı sağlayacağını belirlemek açısından önemlidir. Pazar segmentine göre iptal oranları Grafik-4’te verilmiştir.</w:t>
-      </w:r>
-    </w:p>
-    <w:p>
-      <w:pPr>
-        <w:keepNext/>
-        <w:keepLines/>
-        <w:spacing w:after="0" w:before="180" w:line="240" w:lineRule="auto"/>
-        <w:jc w:val="center"/>
-      </w:pPr>
-      <w:r>
-        <w:drawing>
-          <wp:inline distT="0" distB="0" distL="0" distR="0">
-            <wp:extent cx="3914775" cy="1952625"/>
             <wp:effectExtent t="0" r="0" b="0" l="0"/>
             <wp:docPr id="1" name="" descr="" title=""/>
             <wp:cNvGraphicFramePr>
@@ -4620,6 +4561,111 @@
                   <pic:spPr bwMode="auto">
                     <a:xfrm>
                       <a:off x="0" y="0"/>
+                      <a:ext cx="3914775" cy="2038350"/>
+                    </a:xfrm>
+                    <a:prstGeom prst="rect">
+                      <a:avLst/>
+                    </a:prstGeom>
+                  </pic:spPr>
+                </pic:pic>
+              </a:graphicData>
+            </a:graphic>
+          </wp:inline>
+        </w:drawing>
+      </w:r>
+    </w:p>
+    <w:p>
+      <w:pPr>
+        <w:spacing w:after="180" w:before="0" w:line="240" w:lineRule="auto"/>
+        <w:jc w:val="center"/>
+      </w:pPr>
+      <w:r>
+        <w:rPr>
+          <w:b/>
+          <w:bCs/>
+        </w:rPr>
+        <w:t xml:space="preserve">Grafik-3</w:t>
+      </w:r>
+      <w:r>
+        <w:t xml:space="preserve">. Bekleme Süresinin İptal Durumuna Göre Dağılımı</w:t>
+      </w:r>
+    </w:p>
+    <w:p>
+      <w:pPr>
+        <w:spacing w:after="0" w:before="0" w:line="360" w:lineRule="auto"/>
+        <w:jc w:val="both"/>
+      </w:pPr>
+      <w:r>
+        <w:t xml:space="preserve">Grafik-3’te her iki sınıfın dağılımının da sağa çarpık (right-skewed) olduğu, rezervasyonların büyük bölümünün girişten kısa süre önce yapıldığı görülmektedir. Bununla birlikte iki sınıf arasında belirgin bir fark bulunmaktadır: iptal edilmeyen rezervasyonlar 0-50 gün aralığında yoğunlaşırken, bekleme süresi arttıkça iptal edilen rezervasyonların payı yükselmektedir. Ortalama bekleme süresi iptal edilmeyen rezervasyonlarda yaklaşık 80 gün, iptal edilenlerde ise yaklaşık 145 gündür.</w:t>
+      </w:r>
+    </w:p>
+    <w:p>
+      <w:pPr>
+        <w:spacing w:after="0" w:before="0" w:line="360" w:lineRule="auto"/>
+        <w:jc w:val="both"/>
+      </w:pPr>
+      <w:r>
+        <w:t xml:space="preserve">Bu bulgu sezgisel olarak da tutarlıdır: bir müşteri rezervasyonunu ne kadar erken yaparsa, giriş tarihine kadar planlarının değişmesi için o kadar uzun bir süre geçmektedir. Modelleme açısından sonuç, lead_time özniteliğinin iptal tahmininde en güçlü ayırt edici özniteliklerden biri olacağıdır. Ayrıca dağılımın çarpık olması nedeniyle, mesafe tabanlı algoritmaların kullanılması durumunda bu sütuna ölçeklendirme veya logaritmik dönüşüm uygulanması gerekecektir.</w:t>
+      </w:r>
+    </w:p>
+    <w:p>
+      <w:pPr>
+        <w:pStyle w:val="Heading3"/>
+        <w:spacing w:after="0" w:before="180" w:line="360" w:lineRule="auto"/>
+        <w:jc w:val="left"/>
+      </w:pPr>
+      <w:r>
+        <w:rPr>
+          <w:b/>
+          <w:bCs/>
+        </w:rPr>
+        <w:t xml:space="preserve">2.5.3. Pazar Segmentine Göre İptal Oranları</w:t>
+      </w:r>
+    </w:p>
+    <w:p>
+      <w:pPr>
+        <w:spacing w:after="0" w:before="0" w:line="360" w:lineRule="auto"/>
+        <w:jc w:val="both"/>
+      </w:pPr>
+      <w:r>
+        <w:t xml:space="preserve">Kategorik bir özniteliğin hedef değişkenle ilişkisini incelemek, hangi kategorik özniteliklerin modele katkı sağlayacağını belirlemek açısından önemlidir. Pazar segmentine göre iptal oranları Grafik-4’te verilmiştir.</w:t>
+      </w:r>
+    </w:p>
+    <w:p>
+      <w:pPr>
+        <w:keepNext/>
+        <w:keepLines/>
+        <w:spacing w:after="0" w:before="180" w:line="240" w:lineRule="auto"/>
+        <w:jc w:val="center"/>
+      </w:pPr>
+      <w:r>
+        <w:drawing>
+          <wp:inline distT="0" distB="0" distL="0" distR="0">
+            <wp:extent cx="3914775" cy="1952625"/>
+            <wp:effectExtent t="0" r="0" b="0" l="0"/>
+            <wp:docPr id="1" name="" descr="" title=""/>
+            <wp:cNvGraphicFramePr>
+              <a:graphicFrameLocks xmlns:a="http://schemas.openxmlformats.org/drawingml/2006/main" noChangeAspect="1"/>
+            </wp:cNvGraphicFramePr>
+            <a:graphic xmlns:a="http://schemas.openxmlformats.org/drawingml/2006/main">
+              <a:graphicData uri="http://schemas.openxmlformats.org/drawingml/2006/picture">
+                <pic:pic xmlns:pic="http://schemas.openxmlformats.org/drawingml/2006/picture">
+                  <pic:nvPicPr>
+                    <pic:cNvPr id="0" name="" descr=""/>
+                    <pic:cNvPicPr>
+                      <a:picLocks noChangeAspect="1" noChangeArrowheads="1"/>
+                    </pic:cNvPicPr>
+                  </pic:nvPicPr>
+                  <pic:blipFill>
+                    <a:blip r:embed="rId13" cstate="none"/>
+                    <a:srcRect/>
+                    <a:stretch>
+                      <a:fillRect/>
+                    </a:stretch>
+                  </pic:blipFill>
+                  <pic:spPr bwMode="auto">
+                    <a:xfrm>
+                      <a:off x="0" y="0"/>
                       <a:ext cx="3914775" cy="1952625"/>
                     </a:xfrm>
                     <a:prstGeom prst="rect">
@@ -4725,7 +4771,7 @@
                     </pic:cNvPicPr>
                   </pic:nvPicPr>
                   <pic:blipFill>
-                    <a:blip r:embed="rId13" cstate="none"/>
+                    <a:blip r:embed="rId14" cstate="none"/>
                     <a:srcRect/>
                     <a:stretch>
                       <a:fillRect/>

</xml_diff>